<commit_message>
Sharpen field service recruiter positioning
</commit_message>
<xml_diff>
--- a/assets/Henry_Yang_Biomedical_Engineer_Resume.docx
+++ b/assets/Henry_Yang_Biomedical_Engineer_Resume.docx
@@ -44,7 +44,7 @@
           <w:color w:val="525252"/>
           <w:sz w:val="17"/>
         </w:rPr>
-        <w:t>Sydney, NSW | 0436 016 660 | yangyihang96@gmail.com | Driver licence | Sydney field travel | Work-right check ready</w:t>
+        <w:t>Sydney, NSW | 0436 016 660 | yangyihang96@gmail.com | Driver licence | Sydney field travel | Work-right evidence ready</w:t>
       </w:r>
     </w:p>
     <w:p>
@@ -290,7 +290,7 @@
           <w:i w:val="0"/>
           <w:sz w:val="18"/>
         </w:rPr>
-        <w:t>Functional testing, performance checks, electrical safety awareness, manufacturer procedures, and service reports.</w:t>
+        <w:t>PM procedures, fault diagnosis, functional testing, performance verification, and service reports.</w:t>
       </w:r>
     </w:p>
     <w:p>
@@ -305,7 +305,7 @@
           <w:i w:val="0"/>
           <w:sz w:val="18"/>
         </w:rPr>
-        <w:t>Simpro, equipment history, serial tracking, customer updates, Microsoft Office, Excel, MATLAB, SolidWorks, and Visio.</w:t>
+        <w:t>Simpro / CMMS, equipment history, serial tracking, customer updates, manufacturer documentation, and Microsoft Office.</w:t>
       </w:r>
     </w:p>
     <w:p>
@@ -320,7 +320,7 @@
           <w:i w:val="0"/>
           <w:sz w:val="18"/>
         </w:rPr>
-        <w:t>Mandarin Chinese native; English professional working proficiency.</w:t>
+        <w:t>Electrical safety testing awareness, test equipment familiarity, customer handover, Mandarin Chinese, and professional working English.</w:t>
       </w:r>
     </w:p>
     <w:p>
@@ -485,7 +485,7 @@
           <w:i w:val="0"/>
           <w:sz w:val="18"/>
         </w:rPr>
-        <w:t>Reduced repeat troubleshooting time by keeping service actions, test notes, equipment history, and customer updates aligned in Simpro.</w:t>
+        <w:t>Helped make repeat troubleshooting faster by keeping service actions, test notes, equipment history, and customer updates aligned in Simpro.</w:t>
       </w:r>
     </w:p>
     <w:p>
@@ -500,7 +500,7 @@
           <w:color w:val="11365A"/>
           <w:sz w:val="20"/>
         </w:rPr>
-        <w:t>ROLE FIT</w:t>
+        <w:t>TARGET ROLES</w:t>
       </w:r>
     </w:p>
     <w:p>
@@ -515,7 +515,7 @@
           <w:i w:val="0"/>
           <w:sz w:val="18"/>
         </w:rPr>
-        <w:t>Best fit: Biomedical Field Service Engineer, Medical Device Service Engineer, or Clinical Engineering service support roles.</w:t>
+        <w:t>Biomedical Field Service Engineer.</w:t>
       </w:r>
     </w:p>
     <w:p>
@@ -530,7 +530,7 @@
           <w:i w:val="0"/>
           <w:sz w:val="18"/>
         </w:rPr>
-        <w:t>Field readiness: Sydney-based, driver licence, open to field travel, English / Mandarin communication.</w:t>
+        <w:t>Medical Device Service Engineer.</w:t>
       </w:r>
     </w:p>
     <w:p>
@@ -545,7 +545,97 @@
           <w:i w:val="0"/>
           <w:sz w:val="18"/>
         </w:rPr>
-        <w:t>Screening readiness: work-right check ready for a formal hiring process.</w:t>
+        <w:t>Clinical Engineering Service Support.</w:t>
+      </w:r>
+    </w:p>
+    <w:p>
+      <w:pPr>
+        <w:pStyle w:val="ListBullet"/>
+        <w:spacing w:after="40"/>
+      </w:pPr>
+      <w:r>
+        <w:rPr>
+          <w:rFonts w:ascii="Arial" w:hAnsi="Arial"/>
+          <w:b w:val="0"/>
+          <w:i w:val="0"/>
+          <w:sz w:val="18"/>
+        </w:rPr>
+        <w:t>Biomedical Technician / Service Technician.</w:t>
+      </w:r>
+    </w:p>
+    <w:p>
+      <w:pPr>
+        <w:spacing w:before="160" w:after="60"/>
+      </w:pPr>
+      <w:r>
+        <w:rPr>
+          <w:rFonts w:ascii="Arial" w:hAnsi="Arial"/>
+          <w:b/>
+          <w:i w:val="0"/>
+          <w:color w:val="11365A"/>
+          <w:sz w:val="20"/>
+        </w:rPr>
+        <w:t>FIELD SERVICE TOOLS</w:t>
+      </w:r>
+    </w:p>
+    <w:p>
+      <w:pPr>
+        <w:pStyle w:val="ListBullet"/>
+        <w:spacing w:after="40"/>
+      </w:pPr>
+      <w:r>
+        <w:rPr>
+          <w:rFonts w:ascii="Arial" w:hAnsi="Arial"/>
+          <w:b w:val="0"/>
+          <w:i w:val="0"/>
+          <w:sz w:val="18"/>
+        </w:rPr>
+        <w:t>PM procedures, service manuals, functional testing, performance verification, and clear escalation notes.</w:t>
+      </w:r>
+    </w:p>
+    <w:p>
+      <w:pPr>
+        <w:pStyle w:val="ListBullet"/>
+        <w:spacing w:after="40"/>
+      </w:pPr>
+      <w:r>
+        <w:rPr>
+          <w:rFonts w:ascii="Arial" w:hAnsi="Arial"/>
+          <w:b w:val="0"/>
+          <w:i w:val="0"/>
+          <w:sz w:val="18"/>
+        </w:rPr>
+        <w:t>Simpro / CMMS, service reports, equipment history, customer updates, and handover records.</w:t>
+      </w:r>
+    </w:p>
+    <w:p>
+      <w:pPr>
+        <w:pStyle w:val="ListBullet"/>
+        <w:spacing w:after="40"/>
+      </w:pPr>
+      <w:r>
+        <w:rPr>
+          <w:rFonts w:ascii="Arial" w:hAnsi="Arial"/>
+          <w:b w:val="0"/>
+          <w:i w:val="0"/>
+          <w:sz w:val="18"/>
+        </w:rPr>
+        <w:t>Electrical safety testing awareness, test equipment familiarity, and manufacturer documentation.</w:t>
+      </w:r>
+    </w:p>
+    <w:p>
+      <w:pPr>
+        <w:pStyle w:val="ListBullet"/>
+        <w:spacing w:after="40"/>
+      </w:pPr>
+      <w:r>
+        <w:rPr>
+          <w:rFonts w:ascii="Arial" w:hAnsi="Arial"/>
+          <w:b w:val="0"/>
+          <w:i w:val="0"/>
+          <w:sz w:val="18"/>
+        </w:rPr>
+        <w:t>Mandarin Chinese native; English professional working proficiency.</w:t>
       </w:r>
     </w:p>
     <w:sectPr>

</xml_diff>

<commit_message>
Add clinical service judgement positioning
</commit_message>
<xml_diff>
--- a/assets/Henry_Yang_Biomedical_Engineer_Resume.docx
+++ b/assets/Henry_Yang_Biomedical_Engineer_Resume.docx
@@ -73,7 +73,7 @@
           <w:i w:val="0"/>
           <w:sz w:val="18"/>
         </w:rPr>
-        <w:t>Nearly three years of full-time field and workshop service experience at Nova Biomedical Australia across hospital and pharmacy medical equipment. Core strengths include PM, fault diagnosis, repair, installation support, verification, and service documentation.</w:t>
+        <w:t>Nearly three years of full-time field and workshop service experience at Nova Biomedical Australia across hospital and pharmacy medical equipment. Core strengths include PM, fault diagnosis, repair, installation support, verification, service documentation, and safe return-to-use decisions.</w:t>
       </w:r>
     </w:p>
     <w:p>
@@ -170,7 +170,7 @@
           <w:i w:val="0"/>
           <w:sz w:val="18"/>
         </w:rPr>
-        <w:t>Maintain Simpro work orders, service reports, equipment history, and customer updates so service decisions remain traceable.</w:t>
+        <w:t>Use manufacturer-led checks, service history, and functional evidence to document whether equipment is ready for use, monitored, or escalated.</w:t>
       </w:r>
     </w:p>
     <w:p>
@@ -185,7 +185,7 @@
           <w:i w:val="0"/>
           <w:sz w:val="18"/>
         </w:rPr>
-        <w:t>Hand over next-use status clearly to clinical users, biomedical teams, vendors, and internal engineers.</w:t>
+        <w:t>Maintain Simpro work orders, service reports, equipment history, and customer updates so service records as engineering evidence remain traceable.</w:t>
       </w:r>
     </w:p>
     <w:p>
@@ -290,7 +290,7 @@
           <w:i w:val="0"/>
           <w:sz w:val="18"/>
         </w:rPr>
-        <w:t>PM procedures, fault diagnosis, functional testing, performance verification, and service reports.</w:t>
+        <w:t>PM procedures, fault diagnosis, functional testing, performance verification, service reports, and escalation notes.</w:t>
       </w:r>
     </w:p>
     <w:p>
@@ -305,7 +305,7 @@
           <w:i w:val="0"/>
           <w:sz w:val="18"/>
         </w:rPr>
-        <w:t>Simpro / CMMS, equipment history, serial tracking, customer updates, manufacturer documentation, and Microsoft Office.</w:t>
+        <w:t>Simpro / CMMS, equipment history, serial tracking, customer updates, traceability, manufacturer documentation, and Microsoft Office.</w:t>
       </w:r>
     </w:p>
     <w:p>
@@ -425,7 +425,7 @@
           <w:i w:val="0"/>
           <w:sz w:val="18"/>
         </w:rPr>
-        <w:t>MPhil thesis: Flexible Electrodes for Smart Bandages: Feasibility Exploration.</w:t>
+        <w:t>MPhil thesis: flexible electrodes, impedance measurement, validation evidence, and technical documentation.</w:t>
       </w:r>
     </w:p>
     <w:p>
@@ -470,7 +470,7 @@
           <w:i w:val="0"/>
           <w:sz w:val="18"/>
         </w:rPr>
-        <w:t>Diagnosed user-reported faults by separating use condition, repair history, reproducible symptoms, service-manual steps, and post-repair verification.</w:t>
+        <w:t>Diagnosed user-reported faults by separating device condition, accessory context, workflow, repair history, reproducible symptoms, manual-led checks, and post-repair verification.</w:t>
       </w:r>
     </w:p>
     <w:p>
@@ -485,7 +485,7 @@
           <w:i w:val="0"/>
           <w:sz w:val="18"/>
         </w:rPr>
-        <w:t>Helped make repeat troubleshooting faster by keeping service actions, test notes, equipment history, and customer updates aligned in Simpro.</w:t>
+        <w:t>Supported next-use decisions by documenting whether equipment was ready for use, monitored, or escalated based on post-service evidence.</w:t>
       </w:r>
     </w:p>
     <w:p>
@@ -605,7 +605,7 @@
           <w:i w:val="0"/>
           <w:sz w:val="18"/>
         </w:rPr>
-        <w:t>Simpro / CMMS, service reports, equipment history, customer updates, and handover records.</w:t>
+        <w:t>Simpro / CMMS, service reports, equipment history, customer updates, handover records, and service records as engineering evidence.</w:t>
       </w:r>
     </w:p>
     <w:p>

</xml_diff>

<commit_message>
Refine public copy wording
</commit_message>
<xml_diff>
--- a/assets/Henry_Yang_Biomedical_Engineer_Resume.docx
+++ b/assets/Henry_Yang_Biomedical_Engineer_Resume.docx
@@ -44,7 +44,7 @@
           <w:color w:val="525252"/>
           <w:sz w:val="17"/>
         </w:rPr>
-        <w:t>Sydney, NSW | 0436 016 660 | yangyihang96@gmail.com | Driver licence | Sydney field travel | Work-right evidence ready</w:t>
+        <w:t>Sydney, NSW | 0436 016 660 | yangyihang96@gmail.com | Driver licence | Sydney field travel | Work-right check ready</w:t>
       </w:r>
     </w:p>
     <w:p>
@@ -73,7 +73,7 @@
           <w:i w:val="0"/>
           <w:sz w:val="18"/>
         </w:rPr>
-        <w:t>Nearly three years of full-time field and workshop service experience at Nova Biomedical Australia across hospital and pharmacy medical equipment. Core strengths include PM, fault diagnosis, repair, installation support, verification, service documentation, and safe return-to-use decisions.</w:t>
+        <w:t>Nearly three years of full-time field and workshop service experience at Nova Biomedical Australia across hospital and pharmacy medical equipment. Core strengths include PM, fault diagnosis, repair, installation support, verification, service documentation, and return-to-use or escalation records.</w:t>
       </w:r>
     </w:p>
     <w:p>
@@ -155,7 +155,7 @@
           <w:i w:val="0"/>
           <w:sz w:val="18"/>
         </w:rPr>
-        <w:t>Returned devices with functional checks, performance evidence, or clear escalation status.</w:t>
+        <w:t>Document service outcomes with functional checks, performance evidence, or clear escalation status.</w:t>
       </w:r>
     </w:p>
     <w:p>
@@ -170,7 +170,7 @@
           <w:i w:val="0"/>
           <w:sz w:val="18"/>
         </w:rPr>
-        <w:t>Use manufacturer-led checks, service history, and functional evidence to document whether equipment is ready for use, monitored, or escalated.</w:t>
+        <w:t>Use manufacturer-led checks, service history, and functional evidence to document whether equipment is ready for use, requires monitoring, or needs escalation.</w:t>
       </w:r>
     </w:p>
     <w:p>
@@ -185,7 +185,7 @@
           <w:i w:val="0"/>
           <w:sz w:val="18"/>
         </w:rPr>
-        <w:t>Maintain Simpro work orders, service reports, equipment history, and customer updates so service records as engineering evidence remain traceable.</w:t>
+        <w:t>Maintain Simpro work orders, service reports, equipment history, and communication notes so service records remain traceable engineering evidence.</w:t>
       </w:r>
     </w:p>
     <w:p>
@@ -305,7 +305,7 @@
           <w:i w:val="0"/>
           <w:sz w:val="18"/>
         </w:rPr>
-        <w:t>Simpro / CMMS, equipment history, serial tracking, customer updates, traceability, manufacturer documentation, and Microsoft Office.</w:t>
+        <w:t>Simpro / CMMS, equipment history, equipment identifiers, communication notes, traceability, manufacturer documentation, and Microsoft Office.</w:t>
       </w:r>
     </w:p>
     <w:p>
@@ -335,7 +335,7 @@
           <w:color w:val="11365A"/>
           <w:sz w:val="20"/>
         </w:rPr>
-        <w:t>EARLIER HEALTHCARE RECORDS</w:t>
+        <w:t>EARLIER HEALTHCARE DOCUMENTATION</w:t>
       </w:r>
     </w:p>
     <w:p>
@@ -485,7 +485,7 @@
           <w:i w:val="0"/>
           <w:sz w:val="18"/>
         </w:rPr>
-        <w:t>Supported next-use decisions by documenting whether equipment was ready for use, monitored, or escalated based on post-service evidence.</w:t>
+        <w:t>Supported next-use decisions by documenting whether equipment was ready for use, required monitoring, or needed escalation based on post-service evidence.</w:t>
       </w:r>
     </w:p>
     <w:p>
@@ -605,7 +605,7 @@
           <w:i w:val="0"/>
           <w:sz w:val="18"/>
         </w:rPr>
-        <w:t>Simpro / CMMS, service reports, equipment history, customer updates, handover records, and service records as engineering evidence.</w:t>
+        <w:t>Simpro / CMMS, service reports, equipment history, communication notes, handover records, and traceable service evidence.</w:t>
       </w:r>
     </w:p>
     <w:p>

</xml_diff>